<commit_message>
add Content Item Page and Section Group Item
</commit_message>
<xml_diff>
--- a/راهنما مراحل ایجاد فرم ساده.docx
+++ b/راهنما مراحل ایجاد فرم ساده.docx
@@ -11305,16 +11305,23 @@
       <w:pPr>
         <w:bidi/>
         <w:rPr>
-          <w:rFonts w:ascii="Aptos Display" w:hAnsi="Aptos Display" w:cstheme="minorHAnsi"/>
-          <w:sz w:val="24"/>
-          <w:szCs w:val="24"/>
+          <w:rFonts w:ascii="Aptos Display" w:hAnsi="Aptos Display" w:cs="Calibri"/>
+          <w:b/>
+          <w:bCs/>
+          <w:color w:val="FF0000"/>
+          <w:sz w:val="32"/>
+          <w:szCs w:val="32"/>
+          <w:rtl/>
         </w:rPr>
       </w:pPr>
       <w:r>
         <w:rPr>
           <w:rFonts w:ascii="Aptos Display" w:hAnsi="Aptos Display" w:cs="Segoe UI Emoji"/>
-          <w:sz w:val="24"/>
-          <w:szCs w:val="24"/>
+          <w:b/>
+          <w:bCs/>
+          <w:color w:val="FF0000"/>
+          <w:sz w:val="32"/>
+          <w:szCs w:val="32"/>
           <w:rtl/>
         </w:rPr>
         <w:t>📌</w:t>
@@ -11322,8 +11329,11 @@
       <w:r>
         <w:rPr>
           <w:rFonts w:ascii="Aptos Display" w:hAnsi="Aptos Display" w:cstheme="minorHAnsi"/>
-          <w:sz w:val="24"/>
-          <w:szCs w:val="24"/>
+          <w:b/>
+          <w:bCs/>
+          <w:color w:val="FF0000"/>
+          <w:sz w:val="32"/>
+          <w:szCs w:val="32"/>
           <w:rtl/>
         </w:rPr>
         <w:t xml:space="preserve"> </w:t>
@@ -11331,8 +11341,11 @@
       <w:r>
         <w:rPr>
           <w:rFonts w:ascii="Aptos Display" w:hAnsi="Aptos Display" w:cs="Calibri"/>
-          <w:sz w:val="24"/>
-          <w:szCs w:val="24"/>
+          <w:b/>
+          <w:bCs/>
+          <w:color w:val="FF0000"/>
+          <w:sz w:val="32"/>
+          <w:szCs w:val="32"/>
           <w:rtl/>
         </w:rPr>
         <w:t>ساختار</w:t>
@@ -11340,8 +11353,11 @@
       <w:r>
         <w:rPr>
           <w:rFonts w:ascii="Aptos Display" w:hAnsi="Aptos Display" w:cstheme="minorHAnsi"/>
-          <w:sz w:val="24"/>
-          <w:szCs w:val="24"/>
+          <w:b/>
+          <w:bCs/>
+          <w:color w:val="FF0000"/>
+          <w:sz w:val="32"/>
+          <w:szCs w:val="32"/>
           <w:rtl/>
         </w:rPr>
         <w:t xml:space="preserve"> </w:t>
@@ -11349,8 +11365,11 @@
       <w:r>
         <w:rPr>
           <w:rFonts w:ascii="Aptos Display" w:hAnsi="Aptos Display" w:cs="Calibri"/>
-          <w:sz w:val="24"/>
-          <w:szCs w:val="24"/>
+          <w:b/>
+          <w:bCs/>
+          <w:color w:val="FF0000"/>
+          <w:sz w:val="32"/>
+          <w:szCs w:val="32"/>
           <w:rtl/>
         </w:rPr>
         <w:t>منو</w:t>
@@ -11358,8 +11377,11 @@
       <w:r>
         <w:rPr>
           <w:rFonts w:ascii="Aptos Display" w:hAnsi="Aptos Display" w:cstheme="minorHAnsi"/>
-          <w:sz w:val="24"/>
-          <w:szCs w:val="24"/>
+          <w:b/>
+          <w:bCs/>
+          <w:color w:val="FF0000"/>
+          <w:sz w:val="32"/>
+          <w:szCs w:val="32"/>
           <w:rtl/>
         </w:rPr>
         <w:t xml:space="preserve"> </w:t>
@@ -11367,8 +11389,11 @@
       <w:r>
         <w:rPr>
           <w:rFonts w:ascii="Aptos Display" w:hAnsi="Aptos Display" w:cs="Calibri"/>
-          <w:sz w:val="24"/>
-          <w:szCs w:val="24"/>
+          <w:b/>
+          <w:bCs/>
+          <w:color w:val="FF0000"/>
+          <w:sz w:val="32"/>
+          <w:szCs w:val="32"/>
           <w:rtl/>
         </w:rPr>
         <w:t>و</w:t>
@@ -11376,8 +11401,11 @@
       <w:r>
         <w:rPr>
           <w:rFonts w:ascii="Aptos Display" w:hAnsi="Aptos Display" w:cstheme="minorHAnsi"/>
-          <w:sz w:val="24"/>
-          <w:szCs w:val="24"/>
+          <w:b/>
+          <w:bCs/>
+          <w:color w:val="FF0000"/>
+          <w:sz w:val="32"/>
+          <w:szCs w:val="32"/>
           <w:rtl/>
         </w:rPr>
         <w:t xml:space="preserve"> </w:t>
@@ -11385,12 +11413,430 @@
       <w:r>
         <w:rPr>
           <w:rFonts w:ascii="Aptos Display" w:hAnsi="Aptos Display" w:cs="Calibri"/>
-          <w:sz w:val="24"/>
-          <w:szCs w:val="24"/>
+          <w:b/>
+          <w:bCs/>
+          <w:color w:val="FF0000"/>
+          <w:sz w:val="32"/>
+          <w:szCs w:val="32"/>
           <w:rtl/>
         </w:rPr>
         <w:t>صفحه</w:t>
       </w:r>
+    </w:p>
+    <w:p>
+      <w:pPr>
+        <w:bidi/>
+        <w:spacing w:before="100" w:beforeAutospacing="1" w:after="100" w:afterAutospacing="1" w:line="240" w:lineRule="auto"/>
+        <w:rPr>
+          <w:rFonts w:ascii="Times New Roman" w:eastAsia="Times New Roman" w:hAnsi="Times New Roman" w:cs="Times New Roman"/>
+          <w:b/>
+          <w:bCs/>
+          <w:color w:val="FF0000"/>
+          <w:sz w:val="32"/>
+          <w:szCs w:val="32"/>
+          <w:rtl/>
+        </w:rPr>
+      </w:pPr>
+      <w:r>
+        <w:rPr>
+          <w:rFonts w:ascii="Times New Roman" w:eastAsia="Times New Roman" w:hAnsi="Times New Roman" w:cs="Times New Roman"/>
+          <w:b/>
+          <w:bCs/>
+          <w:color w:val="FF0000"/>
+          <w:sz w:val="32"/>
+          <w:szCs w:val="32"/>
+          <w:rtl/>
+        </w:rPr>
+        <w:t>برای نام‌گذاری</w:t>
+      </w:r>
+      <w:r>
+        <w:rPr>
+          <w:rFonts w:ascii="Times New Roman" w:eastAsia="Times New Roman" w:hAnsi="Times New Roman" w:cs="Times New Roman"/>
+          <w:b/>
+          <w:bCs/>
+          <w:color w:val="FF0000"/>
+          <w:sz w:val="32"/>
+          <w:szCs w:val="32"/>
+        </w:rPr>
+        <w:t xml:space="preserve"> Resource Code </w:t>
+      </w:r>
+      <w:r>
+        <w:rPr>
+          <w:rFonts w:ascii="Times New Roman" w:eastAsia="Times New Roman" w:hAnsi="Times New Roman" w:cs="Times New Roman"/>
+          <w:b/>
+          <w:bCs/>
+          <w:color w:val="FF0000"/>
+          <w:sz w:val="32"/>
+          <w:szCs w:val="32"/>
+          <w:rtl/>
+        </w:rPr>
+        <w:t>ها از</w:t>
+      </w:r>
+      <w:r>
+        <w:rPr>
+          <w:rFonts w:ascii="Times New Roman" w:eastAsia="Times New Roman" w:hAnsi="Times New Roman" w:cs="Times New Roman"/>
+          <w:b/>
+          <w:bCs/>
+          <w:color w:val="FF0000"/>
+          <w:sz w:val="32"/>
+          <w:szCs w:val="32"/>
+        </w:rPr>
+        <w:t xml:space="preserve"> </w:t>
+      </w:r>
+      <w:proofErr w:type="spellStart"/>
+      <w:r>
+        <w:rPr>
+          <w:rFonts w:ascii="Times New Roman" w:eastAsia="Times New Roman" w:hAnsi="Times New Roman" w:cs="Times New Roman"/>
+          <w:b/>
+          <w:bCs/>
+          <w:color w:val="FF0000"/>
+          <w:sz w:val="32"/>
+          <w:szCs w:val="32"/>
+        </w:rPr>
+        <w:t>PascalCase</w:t>
+      </w:r>
+      <w:proofErr w:type="spellEnd"/>
+      <w:r>
+        <w:rPr>
+          <w:rFonts w:ascii="Times New Roman" w:eastAsia="Times New Roman" w:hAnsi="Times New Roman" w:cs="Times New Roman"/>
+          <w:b/>
+          <w:bCs/>
+          <w:color w:val="FF0000"/>
+          <w:sz w:val="32"/>
+          <w:szCs w:val="32"/>
+        </w:rPr>
+        <w:t xml:space="preserve"> </w:t>
+      </w:r>
+      <w:r>
+        <w:rPr>
+          <w:rFonts w:ascii="Times New Roman" w:eastAsia="Times New Roman" w:hAnsi="Times New Roman" w:cs="Times New Roman"/>
+          <w:b/>
+          <w:bCs/>
+          <w:color w:val="FF0000"/>
+          <w:sz w:val="32"/>
+          <w:szCs w:val="32"/>
+          <w:rtl/>
+        </w:rPr>
+        <w:t>استفاده کنید</w:t>
+      </w:r>
+      <w:r>
+        <w:rPr>
+          <w:rFonts w:ascii="Times New Roman" w:eastAsia="Times New Roman" w:hAnsi="Times New Roman" w:cs="Times New Roman"/>
+          <w:b/>
+          <w:bCs/>
+          <w:color w:val="FF0000"/>
+          <w:sz w:val="32"/>
+          <w:szCs w:val="32"/>
+        </w:rPr>
+        <w:t>.</w:t>
+      </w:r>
+      <w:r>
+        <w:rPr>
+          <w:rFonts w:ascii="Times New Roman" w:eastAsia="Times New Roman" w:hAnsi="Times New Roman" w:cs="Times New Roman" w:hint="cs"/>
+          <w:b/>
+          <w:bCs/>
+          <w:color w:val="FF0000"/>
+          <w:sz w:val="32"/>
+          <w:szCs w:val="32"/>
+          <w:rtl/>
+        </w:rPr>
+        <w:t xml:space="preserve"> همانند</w:t>
+      </w:r>
+    </w:p>
+    <w:p>
+      <w:pPr>
+        <w:bidi/>
+        <w:spacing w:before="100" w:beforeAutospacing="1" w:after="100" w:afterAutospacing="1" w:line="240" w:lineRule="auto"/>
+        <w:rPr>
+          <w:rFonts w:ascii="Times New Roman" w:eastAsia="Times New Roman" w:hAnsi="Times New Roman" w:cs="Times New Roman"/>
+          <w:sz w:val="24"/>
+          <w:szCs w:val="24"/>
+        </w:rPr>
+      </w:pPr>
+      <w:r>
+        <w:rPr>
+          <w:rFonts w:ascii="Cascadia Mono" w:hAnsi="Cascadia Mono" w:cs="Cascadia Mono"/>
+          <w:color w:val="A31515"/>
+          <w:sz w:val="19"/>
+          <w:szCs w:val="19"/>
+          <w:highlight w:val="white"/>
+        </w:rPr>
+        <w:t>SECTIONGROUPITEM_MANAGEMENT</w:t>
+      </w:r>
+    </w:p>
+    <w:p>
+      <w:pPr>
+        <w:numPr>
+          <w:ilvl w:val="0"/>
+          <w:numId w:val="14"/>
+        </w:numPr>
+        <w:bidi/>
+        <w:spacing w:before="100" w:beforeAutospacing="1" w:after="100" w:afterAutospacing="1" w:line="240" w:lineRule="auto"/>
+        <w:rPr>
+          <w:rFonts w:ascii="Times New Roman" w:eastAsia="Times New Roman" w:hAnsi="Times New Roman" w:cs="Times New Roman"/>
+          <w:sz w:val="24"/>
+          <w:szCs w:val="24"/>
+        </w:rPr>
+      </w:pPr>
+      <w:r>
+        <w:rPr>
+          <w:rFonts w:ascii="Times New Roman" w:eastAsia="Times New Roman" w:hAnsi="Times New Roman" w:cs="Times New Roman"/>
+          <w:sz w:val="24"/>
+          <w:szCs w:val="24"/>
+          <w:rtl/>
+        </w:rPr>
+        <w:t xml:space="preserve">از </w:t>
+      </w:r>
+      <w:r>
+        <w:rPr>
+          <w:rFonts w:ascii="Courier New" w:eastAsia="Times New Roman" w:hAnsi="Courier New" w:cs="Courier New"/>
+          <w:sz w:val="20"/>
+          <w:szCs w:val="20"/>
+        </w:rPr>
+        <w:t>_</w:t>
+      </w:r>
+      <w:r>
+        <w:rPr>
+          <w:rFonts w:ascii="Times New Roman" w:eastAsia="Times New Roman" w:hAnsi="Times New Roman" w:cs="Times New Roman"/>
+          <w:sz w:val="24"/>
+          <w:szCs w:val="24"/>
+        </w:rPr>
+        <w:t xml:space="preserve"> </w:t>
+      </w:r>
+      <w:r>
+        <w:rPr>
+          <w:rFonts w:ascii="Times New Roman" w:eastAsia="Times New Roman" w:hAnsi="Times New Roman" w:cs="Times New Roman"/>
+          <w:sz w:val="24"/>
+          <w:szCs w:val="24"/>
+          <w:rtl/>
+        </w:rPr>
+        <w:t xml:space="preserve">و </w:t>
+      </w:r>
+      <w:r>
+        <w:rPr>
+          <w:rFonts w:ascii="Courier New" w:eastAsia="Times New Roman" w:hAnsi="Courier New" w:cs="Courier New"/>
+          <w:sz w:val="20"/>
+          <w:szCs w:val="20"/>
+        </w:rPr>
+        <w:t>-</w:t>
+      </w:r>
+      <w:r>
+        <w:rPr>
+          <w:rFonts w:ascii="Times New Roman" w:eastAsia="Times New Roman" w:hAnsi="Times New Roman" w:cs="Times New Roman"/>
+          <w:sz w:val="24"/>
+          <w:szCs w:val="24"/>
+        </w:rPr>
+        <w:t xml:space="preserve"> </w:t>
+      </w:r>
+      <w:r>
+        <w:rPr>
+          <w:rFonts w:ascii="Times New Roman" w:eastAsia="Times New Roman" w:hAnsi="Times New Roman" w:cs="Times New Roman"/>
+          <w:sz w:val="24"/>
+          <w:szCs w:val="24"/>
+          <w:rtl/>
+        </w:rPr>
+        <w:t>استفاده نکنید</w:t>
+      </w:r>
+      <w:r>
+        <w:rPr>
+          <w:rFonts w:ascii="Times New Roman" w:eastAsia="Times New Roman" w:hAnsi="Times New Roman" w:cs="Times New Roman"/>
+          <w:sz w:val="24"/>
+          <w:szCs w:val="24"/>
+        </w:rPr>
+        <w:t>.</w:t>
+      </w:r>
+    </w:p>
+    <w:p>
+      <w:pPr>
+        <w:numPr>
+          <w:ilvl w:val="0"/>
+          <w:numId w:val="14"/>
+        </w:numPr>
+        <w:bidi/>
+        <w:spacing w:before="100" w:beforeAutospacing="1" w:after="100" w:afterAutospacing="1" w:line="240" w:lineRule="auto"/>
+        <w:rPr>
+          <w:rFonts w:ascii="Times New Roman" w:eastAsia="Times New Roman" w:hAnsi="Times New Roman" w:cs="Times New Roman"/>
+          <w:sz w:val="24"/>
+          <w:szCs w:val="24"/>
+        </w:rPr>
+      </w:pPr>
+      <w:r>
+        <w:rPr>
+          <w:rFonts w:ascii="Times New Roman" w:eastAsia="Times New Roman" w:hAnsi="Times New Roman" w:cs="Times New Roman"/>
+          <w:sz w:val="24"/>
+          <w:szCs w:val="24"/>
+          <w:rtl/>
+        </w:rPr>
+        <w:t>نام‌ها کوتاه، خوانا و معنادار باشند</w:t>
+      </w:r>
+      <w:r>
+        <w:rPr>
+          <w:rFonts w:ascii="Times New Roman" w:eastAsia="Times New Roman" w:hAnsi="Times New Roman" w:cs="Times New Roman"/>
+          <w:sz w:val="24"/>
+          <w:szCs w:val="24"/>
+        </w:rPr>
+        <w:t>.</w:t>
+      </w:r>
+    </w:p>
+    <w:p>
+      <w:pPr>
+        <w:numPr>
+          <w:ilvl w:val="0"/>
+          <w:numId w:val="14"/>
+        </w:numPr>
+        <w:bidi/>
+        <w:spacing w:before="100" w:beforeAutospacing="1" w:after="100" w:afterAutospacing="1" w:line="240" w:lineRule="auto"/>
+        <w:rPr>
+          <w:rFonts w:ascii="Times New Roman" w:eastAsia="Times New Roman" w:hAnsi="Times New Roman" w:cs="Times New Roman"/>
+          <w:sz w:val="24"/>
+          <w:szCs w:val="24"/>
+        </w:rPr>
+      </w:pPr>
+      <w:r>
+        <w:rPr>
+          <w:rFonts w:ascii="Times New Roman" w:eastAsia="Times New Roman" w:hAnsi="Times New Roman" w:cs="Times New Roman"/>
+          <w:sz w:val="24"/>
+          <w:szCs w:val="24"/>
+          <w:rtl/>
+        </w:rPr>
+        <w:t xml:space="preserve">برای منوها از الگوی </w:t>
+      </w:r>
+      <w:r>
+        <w:rPr>
+          <w:rFonts w:ascii="Courier New" w:eastAsia="Times New Roman" w:hAnsi="Courier New" w:cs="Courier New"/>
+          <w:sz w:val="20"/>
+          <w:szCs w:val="20"/>
+        </w:rPr>
+        <w:t>Entity</w:t>
+      </w:r>
+      <w:r>
+        <w:rPr>
+          <w:rFonts w:ascii="Courier New" w:eastAsia="Times New Roman" w:hAnsi="Courier New" w:cs="Courier New" w:hint="cs"/>
+          <w:sz w:val="20"/>
+          <w:szCs w:val="20"/>
+          <w:rtl/>
+        </w:rPr>
+        <w:t>_</w:t>
+      </w:r>
+      <w:r>
+        <w:rPr>
+          <w:rFonts w:ascii="Courier New" w:eastAsia="Times New Roman" w:hAnsi="Courier New" w:cs="Courier New"/>
+          <w:sz w:val="20"/>
+          <w:szCs w:val="20"/>
+        </w:rPr>
+        <w:t>Management</w:t>
+      </w:r>
+      <w:r>
+        <w:rPr>
+          <w:rFonts w:ascii="Times New Roman" w:eastAsia="Times New Roman" w:hAnsi="Times New Roman" w:cs="Times New Roman"/>
+          <w:sz w:val="24"/>
+          <w:szCs w:val="24"/>
+        </w:rPr>
+        <w:t xml:space="preserve"> </w:t>
+      </w:r>
+      <w:r>
+        <w:rPr>
+          <w:rFonts w:ascii="Times New Roman" w:eastAsia="Times New Roman" w:hAnsi="Times New Roman" w:cs="Times New Roman"/>
+          <w:sz w:val="24"/>
+          <w:szCs w:val="24"/>
+          <w:rtl/>
+        </w:rPr>
+        <w:t>استفاده شود</w:t>
+      </w:r>
+      <w:r>
+        <w:rPr>
+          <w:rFonts w:ascii="Times New Roman" w:eastAsia="Times New Roman" w:hAnsi="Times New Roman" w:cs="Times New Roman"/>
+          <w:sz w:val="24"/>
+          <w:szCs w:val="24"/>
+        </w:rPr>
+        <w:t>.</w:t>
+      </w:r>
+    </w:p>
+    <w:p>
+      <w:pPr>
+        <w:numPr>
+          <w:ilvl w:val="0"/>
+          <w:numId w:val="14"/>
+        </w:numPr>
+        <w:bidi/>
+        <w:spacing w:before="100" w:beforeAutospacing="1" w:after="100" w:afterAutospacing="1" w:line="240" w:lineRule="auto"/>
+        <w:rPr>
+          <w:rFonts w:ascii="Times New Roman" w:eastAsia="Times New Roman" w:hAnsi="Times New Roman" w:cs="Times New Roman"/>
+          <w:sz w:val="24"/>
+          <w:szCs w:val="24"/>
+        </w:rPr>
+      </w:pPr>
+      <w:r>
+        <w:rPr>
+          <w:rFonts w:ascii="Times New Roman" w:eastAsia="Times New Roman" w:hAnsi="Times New Roman" w:cs="Times New Roman"/>
+          <w:sz w:val="24"/>
+          <w:szCs w:val="24"/>
+          <w:rtl/>
+        </w:rPr>
+        <w:t xml:space="preserve">برای صفحات از الگوی </w:t>
+      </w:r>
+      <w:r>
+        <w:rPr>
+          <w:rFonts w:ascii="Courier New" w:eastAsia="Times New Roman" w:hAnsi="Courier New" w:cs="Courier New"/>
+          <w:sz w:val="20"/>
+          <w:szCs w:val="20"/>
+        </w:rPr>
+        <w:t>Entity</w:t>
+      </w:r>
+      <w:r>
+        <w:rPr>
+          <w:rFonts w:ascii="Courier New" w:eastAsia="Times New Roman" w:hAnsi="Courier New" w:cs="Courier New" w:hint="cs"/>
+          <w:sz w:val="20"/>
+          <w:szCs w:val="20"/>
+          <w:rtl/>
+        </w:rPr>
+        <w:t>_</w:t>
+      </w:r>
+      <w:proofErr w:type="spellStart"/>
+      <w:r>
+        <w:rPr>
+          <w:rFonts w:ascii="Courier New" w:eastAsia="Times New Roman" w:hAnsi="Courier New" w:cs="Courier New"/>
+          <w:sz w:val="20"/>
+          <w:szCs w:val="20"/>
+        </w:rPr>
+        <w:t>ManagementPage</w:t>
+      </w:r>
+      <w:proofErr w:type="spellEnd"/>
+      <w:r>
+        <w:rPr>
+          <w:rFonts w:ascii="Times New Roman" w:eastAsia="Times New Roman" w:hAnsi="Times New Roman" w:cs="Times New Roman"/>
+          <w:sz w:val="24"/>
+          <w:szCs w:val="24"/>
+        </w:rPr>
+        <w:t xml:space="preserve"> </w:t>
+      </w:r>
+      <w:r>
+        <w:rPr>
+          <w:rFonts w:ascii="Times New Roman" w:eastAsia="Times New Roman" w:hAnsi="Times New Roman" w:cs="Times New Roman"/>
+          <w:sz w:val="24"/>
+          <w:szCs w:val="24"/>
+          <w:rtl/>
+        </w:rPr>
+        <w:t>استفاده شود</w:t>
+      </w:r>
+      <w:r>
+        <w:rPr>
+          <w:rFonts w:ascii="Times New Roman" w:eastAsia="Times New Roman" w:hAnsi="Times New Roman" w:cs="Times New Roman"/>
+          <w:sz w:val="24"/>
+          <w:szCs w:val="24"/>
+        </w:rPr>
+        <w:t>.</w:t>
+      </w:r>
+    </w:p>
+    <w:p>
+      <w:pPr>
+        <w:bidi/>
+        <w:rPr>
+          <w:rFonts w:ascii="Aptos Display" w:hAnsi="Aptos Display" w:cstheme="minorHAnsi"/>
+          <w:sz w:val="24"/>
+          <w:szCs w:val="24"/>
+        </w:rPr>
+      </w:pPr>
     </w:p>
     <w:p>
       <w:pPr>
@@ -26514,10 +26960,10 @@
             <v:path o:extrusionok="f" gradientshapeok="t" o:connecttype="rect"/>
             <o:lock v:ext="edit" aspectratio="t"/>
           </v:shapetype>
-          <v:shape id="_x0000_i1036" type="#_x0000_t75" style="width:18pt;height:15.6pt" o:ole="">
+          <v:shape id="_x0000_i1039" type="#_x0000_t75" style="width:18pt;height:15.6pt" o:ole="">
             <v:imagedata r:id="rId5" o:title=""/>
           </v:shape>
-          <w:control r:id="rId6" w:name="DefaultOcxName" w:shapeid="_x0000_i1036"/>
+          <w:control r:id="rId6" w:name="DefaultOcxName" w:shapeid="_x0000_i1039"/>
         </w:object>
       </w:r>
     </w:p>
@@ -40644,7 +41090,7 @@
           <w:szCs w:val="28"/>
         </w:rPr>
         <w:pict w14:anchorId="420780BC">
-          <v:rect id="_x0000_i1038" style="width:0;height:1.5pt" o:hralign="right" o:hrstd="t" o:hr="t" fillcolor="#a0a0a0" stroked="f"/>
+          <v:rect id="_x0000_i1035" style="width:0;height:1.5pt" o:hralign="right" o:hrstd="t" o:hr="t" fillcolor="#a0a0a0" stroked="f"/>
         </w:pict>
       </w:r>
     </w:p>
@@ -42048,7 +42494,7 @@
           <w:szCs w:val="28"/>
         </w:rPr>
         <w:pict w14:anchorId="34E2817E">
-          <v:rect id="_x0000_i1039" style="width:0;height:1.5pt" o:hralign="right" o:hrstd="t" o:hr="t" fillcolor="#a0a0a0" stroked="f"/>
+          <v:rect id="_x0000_i1036" style="width:0;height:1.5pt" o:hralign="right" o:hrstd="t" o:hr="t" fillcolor="#a0a0a0" stroked="f"/>
         </w:pict>
       </w:r>
     </w:p>
@@ -44634,7 +45080,7 @@
           <w:szCs w:val="28"/>
         </w:rPr>
         <w:pict w14:anchorId="708E8667">
-          <v:rect id="_x0000_i1040" style="width:0;height:1.5pt" o:hralign="right" o:hrstd="t" o:hr="t" fillcolor="#a0a0a0" stroked="f"/>
+          <v:rect id="_x0000_i1037" style="width:0;height:1.5pt" o:hralign="right" o:hrstd="t" o:hr="t" fillcolor="#a0a0a0" stroked="f"/>
         </w:pict>
       </w:r>
     </w:p>
@@ -45670,6 +46116,147 @@
     </w:lvl>
   </w:abstractNum>
   <w:abstractNum w:abstractNumId="5" w15:restartNumberingAfterBreak="0">
+    <w:nsid w:val="3AA57B43"/>
+    <w:multiLevelType w:val="multilevel"/>
+    <w:tmpl w:val="FD042DCA"/>
+    <w:lvl w:ilvl="0">
+      <w:start w:val="1"/>
+      <w:numFmt w:val="bullet"/>
+      <w:lvlText w:val=""/>
+      <w:lvlJc w:val="left"/>
+      <w:pPr>
+        <w:tabs>
+          <w:tab w:val="num" w:pos="720"/>
+        </w:tabs>
+        <w:ind w:left="720" w:hanging="360"/>
+      </w:pPr>
+      <w:rPr>
+        <w:rFonts w:ascii="Symbol" w:hAnsi="Symbol" w:hint="default"/>
+        <w:sz w:val="20"/>
+      </w:rPr>
+    </w:lvl>
+    <w:lvl w:ilvl="1" w:tentative="1">
+      <w:numFmt w:val="bullet"/>
+      <w:lvlText w:val="o"/>
+      <w:lvlJc w:val="left"/>
+      <w:pPr>
+        <w:tabs>
+          <w:tab w:val="num" w:pos="1440"/>
+        </w:tabs>
+        <w:ind w:left="1440" w:hanging="360"/>
+      </w:pPr>
+      <w:rPr>
+        <w:rFonts w:ascii="Courier New" w:hAnsi="Courier New" w:hint="default"/>
+        <w:sz w:val="20"/>
+      </w:rPr>
+    </w:lvl>
+    <w:lvl w:ilvl="2" w:tentative="1">
+      <w:numFmt w:val="bullet"/>
+      <w:lvlText w:val=""/>
+      <w:lvlJc w:val="left"/>
+      <w:pPr>
+        <w:tabs>
+          <w:tab w:val="num" w:pos="2160"/>
+        </w:tabs>
+        <w:ind w:left="2160" w:hanging="360"/>
+      </w:pPr>
+      <w:rPr>
+        <w:rFonts w:ascii="Wingdings" w:hAnsi="Wingdings" w:hint="default"/>
+        <w:sz w:val="20"/>
+      </w:rPr>
+    </w:lvl>
+    <w:lvl w:ilvl="3" w:tentative="1">
+      <w:numFmt w:val="bullet"/>
+      <w:lvlText w:val=""/>
+      <w:lvlJc w:val="left"/>
+      <w:pPr>
+        <w:tabs>
+          <w:tab w:val="num" w:pos="2880"/>
+        </w:tabs>
+        <w:ind w:left="2880" w:hanging="360"/>
+      </w:pPr>
+      <w:rPr>
+        <w:rFonts w:ascii="Wingdings" w:hAnsi="Wingdings" w:hint="default"/>
+        <w:sz w:val="20"/>
+      </w:rPr>
+    </w:lvl>
+    <w:lvl w:ilvl="4" w:tentative="1">
+      <w:numFmt w:val="bullet"/>
+      <w:lvlText w:val=""/>
+      <w:lvlJc w:val="left"/>
+      <w:pPr>
+        <w:tabs>
+          <w:tab w:val="num" w:pos="3600"/>
+        </w:tabs>
+        <w:ind w:left="3600" w:hanging="360"/>
+      </w:pPr>
+      <w:rPr>
+        <w:rFonts w:ascii="Wingdings" w:hAnsi="Wingdings" w:hint="default"/>
+        <w:sz w:val="20"/>
+      </w:rPr>
+    </w:lvl>
+    <w:lvl w:ilvl="5" w:tentative="1">
+      <w:numFmt w:val="bullet"/>
+      <w:lvlText w:val=""/>
+      <w:lvlJc w:val="left"/>
+      <w:pPr>
+        <w:tabs>
+          <w:tab w:val="num" w:pos="4320"/>
+        </w:tabs>
+        <w:ind w:left="4320" w:hanging="360"/>
+      </w:pPr>
+      <w:rPr>
+        <w:rFonts w:ascii="Wingdings" w:hAnsi="Wingdings" w:hint="default"/>
+        <w:sz w:val="20"/>
+      </w:rPr>
+    </w:lvl>
+    <w:lvl w:ilvl="6" w:tentative="1">
+      <w:numFmt w:val="bullet"/>
+      <w:lvlText w:val=""/>
+      <w:lvlJc w:val="left"/>
+      <w:pPr>
+        <w:tabs>
+          <w:tab w:val="num" w:pos="5040"/>
+        </w:tabs>
+        <w:ind w:left="5040" w:hanging="360"/>
+      </w:pPr>
+      <w:rPr>
+        <w:rFonts w:ascii="Wingdings" w:hAnsi="Wingdings" w:hint="default"/>
+        <w:sz w:val="20"/>
+      </w:rPr>
+    </w:lvl>
+    <w:lvl w:ilvl="7" w:tentative="1">
+      <w:numFmt w:val="bullet"/>
+      <w:lvlText w:val=""/>
+      <w:lvlJc w:val="left"/>
+      <w:pPr>
+        <w:tabs>
+          <w:tab w:val="num" w:pos="5760"/>
+        </w:tabs>
+        <w:ind w:left="5760" w:hanging="360"/>
+      </w:pPr>
+      <w:rPr>
+        <w:rFonts w:ascii="Wingdings" w:hAnsi="Wingdings" w:hint="default"/>
+        <w:sz w:val="20"/>
+      </w:rPr>
+    </w:lvl>
+    <w:lvl w:ilvl="8" w:tentative="1">
+      <w:numFmt w:val="bullet"/>
+      <w:lvlText w:val=""/>
+      <w:lvlJc w:val="left"/>
+      <w:pPr>
+        <w:tabs>
+          <w:tab w:val="num" w:pos="6480"/>
+        </w:tabs>
+        <w:ind w:left="6480" w:hanging="360"/>
+      </w:pPr>
+      <w:rPr>
+        <w:rFonts w:ascii="Wingdings" w:hAnsi="Wingdings" w:hint="default"/>
+        <w:sz w:val="20"/>
+      </w:rPr>
+    </w:lvl>
+  </w:abstractNum>
+  <w:abstractNum w:abstractNumId="6" w15:restartNumberingAfterBreak="0">
     <w:nsid w:val="4AFC7A61"/>
     <w:multiLevelType w:val="multilevel"/>
     <w:tmpl w:val="5EEE5006"/>
@@ -45810,7 +46397,7 @@
       </w:rPr>
     </w:lvl>
   </w:abstractNum>
-  <w:abstractNum w:abstractNumId="6" w15:restartNumberingAfterBreak="0">
+  <w:abstractNum w:abstractNumId="7" w15:restartNumberingAfterBreak="0">
     <w:nsid w:val="501B5EB3"/>
     <w:multiLevelType w:val="multilevel"/>
     <w:tmpl w:val="ACA47BDC"/>
@@ -45951,7 +46538,7 @@
       </w:rPr>
     </w:lvl>
   </w:abstractNum>
-  <w:abstractNum w:abstractNumId="7" w15:restartNumberingAfterBreak="0">
+  <w:abstractNum w:abstractNumId="8" w15:restartNumberingAfterBreak="0">
     <w:nsid w:val="573D788F"/>
     <w:multiLevelType w:val="multilevel"/>
     <w:tmpl w:val="B32406AE"/>
@@ -46092,7 +46679,7 @@
       </w:rPr>
     </w:lvl>
   </w:abstractNum>
-  <w:abstractNum w:abstractNumId="8" w15:restartNumberingAfterBreak="0">
+  <w:abstractNum w:abstractNumId="9" w15:restartNumberingAfterBreak="0">
     <w:nsid w:val="5A0C4D1A"/>
     <w:multiLevelType w:val="multilevel"/>
     <w:tmpl w:val="53C2B99A"/>
@@ -46233,7 +46820,7 @@
       </w:rPr>
     </w:lvl>
   </w:abstractNum>
-  <w:abstractNum w:abstractNumId="9" w15:restartNumberingAfterBreak="0">
+  <w:abstractNum w:abstractNumId="10" w15:restartNumberingAfterBreak="0">
     <w:nsid w:val="6DB168DA"/>
     <w:multiLevelType w:val="multilevel"/>
     <w:tmpl w:val="5EFC58B6"/>
@@ -46370,7 +46957,7 @@
       </w:rPr>
     </w:lvl>
   </w:abstractNum>
-  <w:abstractNum w:abstractNumId="10" w15:restartNumberingAfterBreak="0">
+  <w:abstractNum w:abstractNumId="11" w15:restartNumberingAfterBreak="0">
     <w:nsid w:val="71774576"/>
     <w:multiLevelType w:val="multilevel"/>
     <w:tmpl w:val="EFC6279C"/>
@@ -46479,7 +47066,7 @@
       </w:pPr>
     </w:lvl>
   </w:abstractNum>
-  <w:abstractNum w:abstractNumId="11" w15:restartNumberingAfterBreak="0">
+  <w:abstractNum w:abstractNumId="12" w15:restartNumberingAfterBreak="0">
     <w:nsid w:val="73D9269A"/>
     <w:multiLevelType w:val="multilevel"/>
     <w:tmpl w:val="594ADE1A"/>
@@ -46584,7 +47171,7 @@
       </w:pPr>
     </w:lvl>
   </w:abstractNum>
-  <w:abstractNum w:abstractNumId="12" w15:restartNumberingAfterBreak="0">
+  <w:abstractNum w:abstractNumId="13" w15:restartNumberingAfterBreak="0">
     <w:nsid w:val="79365808"/>
     <w:multiLevelType w:val="multilevel"/>
     <w:tmpl w:val="FA10C620"/>
@@ -46726,31 +47313,31 @@
     </w:lvl>
   </w:abstractNum>
   <w:num w:numId="1" w16cid:durableId="1310938832">
-    <w:abstractNumId w:val="12"/>
+    <w:abstractNumId w:val="13"/>
   </w:num>
   <w:num w:numId="2" w16cid:durableId="806094971">
-    <w:abstractNumId w:val="8"/>
+    <w:abstractNumId w:val="9"/>
   </w:num>
   <w:num w:numId="3" w16cid:durableId="203560939">
-    <w:abstractNumId w:val="5"/>
+    <w:abstractNumId w:val="6"/>
   </w:num>
   <w:num w:numId="4" w16cid:durableId="973367326">
     <w:abstractNumId w:val="3"/>
   </w:num>
   <w:num w:numId="5" w16cid:durableId="536164080">
-    <w:abstractNumId w:val="6"/>
+    <w:abstractNumId w:val="7"/>
   </w:num>
   <w:num w:numId="6" w16cid:durableId="2104183601">
-    <w:abstractNumId w:val="7"/>
+    <w:abstractNumId w:val="8"/>
   </w:num>
   <w:num w:numId="7" w16cid:durableId="1663199952">
-    <w:abstractNumId w:val="11"/>
+    <w:abstractNumId w:val="12"/>
   </w:num>
   <w:num w:numId="8" w16cid:durableId="1899121567">
     <w:abstractNumId w:val="2"/>
   </w:num>
   <w:num w:numId="9" w16cid:durableId="1292976103">
-    <w:abstractNumId w:val="9"/>
+    <w:abstractNumId w:val="10"/>
   </w:num>
   <w:num w:numId="10" w16cid:durableId="1925139160">
     <w:abstractNumId w:val="0"/>
@@ -46762,7 +47349,10 @@
     <w:abstractNumId w:val="1"/>
   </w:num>
   <w:num w:numId="13" w16cid:durableId="1714882604">
-    <w:abstractNumId w:val="10"/>
+    <w:abstractNumId w:val="11"/>
+  </w:num>
+  <w:num w:numId="14" w16cid:durableId="1642155179">
+    <w:abstractNumId w:val="5"/>
   </w:num>
 </w:numbering>
 </file>
@@ -47416,6 +48006,19 @@
     <w:basedOn w:val="DefaultParagraphFont"/>
     <w:rsid w:val="00341743"/>
   </w:style>
+  <w:style w:type="paragraph" w:customStyle="1" w:styleId="isselectedend">
+    <w:name w:val="isselectedend"/>
+    <w:basedOn w:val="Normal"/>
+    <w:rsid w:val="00D41823"/>
+    <w:pPr>
+      <w:spacing w:before="100" w:beforeAutospacing="1" w:after="100" w:afterAutospacing="1" w:line="240" w:lineRule="auto"/>
+    </w:pPr>
+    <w:rPr>
+      <w:rFonts w:ascii="Times New Roman" w:eastAsia="Times New Roman" w:hAnsi="Times New Roman" w:cs="Times New Roman"/>
+      <w:sz w:val="24"/>
+      <w:szCs w:val="24"/>
+    </w:rPr>
+  </w:style>
 </w:styles>
 </file>
 

</xml_diff>